<commit_message>
Redo moat ranking against prd-2.md
Same rank order. Switching costs and network effects now reflect
family and friend groups and the shared Daily Health Score; the gap
section adds the no-opt-out score visibility.

Co-Authored-By: Claude Opus 5.5 <noreply@anthropic.com>
</commit_message>
<xml_diff>
--- a/07_DietGroceryApp/strategy/moat-ranking.docx
+++ b/07_DietGroceryApp/strategy/moat-ranking.docx
@@ -18,7 +18,7 @@
         <w:t xml:space="preserve">Prepared:</w:t>
       </w:r>
       <w:r>
-        <w:t xml:space="preserve"> October 16, 2026</w:t>
+        <w:t xml:space="preserve"> October 20, 2026</w:t>
       </w:r>
     </w:p>
     <w:p>
@@ -36,7 +36,7 @@
           <w:rPr>
             <w:rStyle w:val="Hyperlink"/>
           </w:rPr>
-          <w:t xml:space="preserve">strategy/spec-audit.md</w:t>
+          <w:t xml:space="preserve">strategy/spec-audit-UPDATED.md</w:t>
         </w:r>
       </w:hyperlink>
       <w:r>
@@ -46,10 +46,10 @@
         <w:rPr>
           <w:rFonts w:ascii="Consolas" w:hAnsi="Consolas"/>
         </w:rPr>
-        <w:t xml:space="preserve">prd-1.md</w:t>
-      </w:r>
-      <w:r>
-        <w:t xml:space="preserve"> (15:27 version) and </w:t>
+        <w:t xml:space="preserve">prd-2.md</w:t>
+      </w:r>
+      <w:r>
+        <w:t xml:space="preserve"> (18:13 version) and </w:t>
       </w:r>
       <w:hyperlink r:id="rHl2">
         <w:r>
@@ -68,21 +68,10 @@
         <w:rPr>
           <w:b/>
         </w:rPr>
-        <w:t xml:space="preserve">A note on sources:</w:t>
-      </w:r>
-      <w:r>
-        <w:t xml:space="preserve"> spec-audit.md audits the *original* prd.md, not prd-1.md. The current audit is </w:t>
-      </w:r>
-      <w:hyperlink r:id="rHl3">
-        <w:r>
-          <w:rPr>
-            <w:rStyle w:val="Hyperlink"/>
-          </w:rPr>
-          <w:t xml:space="preserve">spec-audit-1.md</w:t>
-        </w:r>
-      </w:hyperlink>
-      <w:r>
-        <w:t xml:space="preserve">. The kind of business is the same in both: a consumer diet, recipe and grocery-ordering app for a broad category of eaters. Where the two PRDs differ, prd-1.md is taken as current and the difference is noted.</w:t>
+        <w:t xml:space="preserve">What changed since the October 16 ranking:</w:t>
+      </w:r>
+      <w:r>
+        <w:t xml:space="preserve"> prd-2.md adds family and friend groups, a Daily Health Score that users share and compare, and a permanent "Inventory" out-of-scope item. The rank order is the same. The reasons for switching costs and network effects have changed, and THE GAP now covers the new score visibility rules.</w:t>
       </w:r>
     </w:p>
     <w:p>
@@ -271,7 +260,7 @@
               <w:rPr>
                 <w:sz w:val="18"/>
               </w:rPr>
-              <w:t xml:space="preserve">Every feature HushPlate promises already exists somewhere in the category, so without a cost to leaving, a user can move to a rival the day it matches us. In consumer diet apps, the thing users fight hardest to keep is their accumulated data.</w:t>
+              <w:t xml:space="preserve">Every feature in prd-2.md already exists somewhere in the category, so without a cost to leaving, a user can move to a rival the day it matches us. In consumer diet apps, the thing users fight hardest to keep is their accumulated data.</w:t>
             </w:r>
           </w:p>
         </w:tc>
@@ -339,7 +328,7 @@
               <w:rPr>
                 <w:sz w:val="18"/>
               </w:rPr>
-              <w:t xml:space="preserve">This is a consumer health app that holds health statistics and routes grocery payments. When features are near-identical, users default to the name they already trust, and the category's biggest complaint is about trust, not software.</w:t>
+              <w:t xml:space="preserve">This is a consumer health app that holds health statistics, routes grocery payments, and now publishes some users' scores to everyone. When features are near-identical, users default to the name they already trust, and the category's biggest complaint is about trust, not software.</w:t>
             </w:r>
           </w:p>
         </w:tc>
@@ -407,23 +396,23 @@
               <w:rPr>
                 <w:sz w:val="18"/>
               </w:rPr>
-              <w:t xml:space="preserve">Apps in this category lose users to bad execution: plans that make no sense, exclusions that don't hold, wrong nutrition numbers. A rival that does the same job reliably takes the users we disappoint.</w:t>
-            </w:r>
-          </w:p>
-        </w:tc>
-        <w:tc>
-          <w:tcPr>
-            <w:tcW w:w="2520" w:type="dxa"/>
-          </w:tcPr>
-          <w:p>
-            <w:pPr>
-              <w:spacing w:before="40" w:after="40"/>
-            </w:pPr>
-            <w:r>
-              <w:rPr>
-                <w:sz w:val="18"/>
-              </w:rPr>
-              <w:t xml:space="preserve">competitors.md: Eat This Much "Nonsensical/repetitive generated plans (39%)"; MacroFactor "Database/import accuracy (42%)"; MealPrepPro "ignores stated exclusions"; "An exclusion that actually holds ... is a small feature with outsized trust value."</w:t>
+              <w:t xml:space="preserve">Apps in this category lose users to bad execution: plans that make no sense, exclusions that don't hold, wrong nutrition numbers. prd-2.md adds more that has to be right every day: meal-time alerts, a 50/30/20 score, and quarter-hour bedtime bands. A rival that does the same job more reliably takes the users we disappoint.</w:t>
+            </w:r>
+          </w:p>
+        </w:tc>
+        <w:tc>
+          <w:tcPr>
+            <w:tcW w:w="2520" w:type="dxa"/>
+          </w:tcPr>
+          <w:p>
+            <w:pPr>
+              <w:spacing w:before="40" w:after="40"/>
+            </w:pPr>
+            <w:r>
+              <w:rPr>
+                <w:sz w:val="18"/>
+              </w:rPr>
+              <w:t xml:space="preserve">competitors.md: Eat This Much "Nonsensical/repetitive generated plans (39%)"; MacroFactor "Database/import accuracy (42%)"; MealPrepPro "ignores stated exclusions."</w:t>
             </w:r>
           </w:p>
         </w:tc>
@@ -475,23 +464,23 @@
               <w:rPr>
                 <w:sz w:val="18"/>
               </w:rPr>
-              <w:t xml:space="preserve">The core product is single-player: one person's goals, recipes, cart and audit. Another user joining doesn't change whether my weekly plan or grocery order works, so lacking network effects wouldn't by itself push users to a rival.</w:t>
-            </w:r>
-          </w:p>
-        </w:tc>
-        <w:tc>
-          <w:tcPr>
-            <w:tcW w:w="2520" w:type="dxa"/>
-          </w:tcPr>
-          <w:p>
-            <w:pPr>
-              <w:spacing w:before="40" w:after="40"/>
-            </w:pPr>
-            <w:r>
-              <w:rPr>
-                <w:sz w:val="18"/>
-              </w:rPr>
-              <w:t xml:space="preserve">prd-1.md's only cross-user mechanism is "weekly recommendations to all users" from "popular choices for top 10% of users." spec-audit.md, section 4, read the original PRD as "neither."</w:t>
+              <w:t xml:space="preserve">The core product is still single-player: one person's goals, recipes, cart, meal times and audit. Groups and top-10% comparisons add a social layer on top, so losing them would weaken the product. A rival without them would still deliver the plan and the cart, though, so their absence isn't how users get taken.</w:t>
+            </w:r>
+          </w:p>
+        </w:tc>
+        <w:tc>
+          <w:tcPr>
+            <w:tcW w:w="2520" w:type="dxa"/>
+          </w:tcPr>
+          <w:p>
+            <w:pPr>
+              <w:spacing w:before="40" w:after="40"/>
+            </w:pPr>
+            <w:r>
+              <w:rPr>
+                <w:sz w:val="18"/>
+              </w:rPr>
+              <w:t xml:space="preserve">spec-audit-UPDATED.md, section 4: groups make the product "more useful to each user as their own contacts join." prd-2.md: groups are "for accountability, where the user can share their Daily Health Score."</w:t>
             </w:r>
           </w:p>
         </w:tc>
@@ -543,23 +532,23 @@
               <w:rPr>
                 <w:sz w:val="18"/>
               </w:rPr>
-              <w:t xml:space="preserve">Software here costs little per extra user. The costly inputs (AI agent orders, recipe and nutrition data) are bought per use by everyone, and small, unfunded rivals already survive at low prices. Scale helps a bigger rival give more away free, but it isn't how users get taken.</w:t>
-            </w:r>
-          </w:p>
-        </w:tc>
-        <w:tc>
-          <w:tcPr>
-            <w:tcW w:w="2520" w:type="dxa"/>
-          </w:tcPr>
-          <w:p>
-            <w:pPr>
-              <w:spacing w:before="40" w:after="40"/>
-            </w:pPr>
-            <w:r>
-              <w:rPr>
-                <w:sz w:val="18"/>
-              </w:rPr>
-              <w:t xml:space="preserve">competitors.md: Plan to Eat, "Independently owned, no investors," "$5.95/mo"; MacroFactor "no outside funding found [UNVERIFIED]"; Samsung Food "large free tier."</w:t>
+              <w:t xml:space="preserve">Software here costs little per extra user. The costly inputs (AI agent orders, recipe and nutrition data) are bought per use by everyone, and prd-2.md rules out holding stock, the one place volume might lower costs. Small, unfunded rivals already survive at low prices.</w:t>
+            </w:r>
+          </w:p>
+        </w:tc>
+        <w:tc>
+          <w:tcPr>
+            <w:tcW w:w="2520" w:type="dxa"/>
+          </w:tcPr>
+          <w:p>
+            <w:pPr>
+              <w:spacing w:before="40" w:after="40"/>
+            </w:pPr>
+            <w:r>
+              <w:rPr>
+                <w:sz w:val="18"/>
+              </w:rPr>
+              <w:t xml:space="preserve">prd-2.md: "Permanently out of scope items: Inventory (we do not keep any inventory)." competitors.md: Plan to Eat, "Independently owned, no investors," "$5.95/mo."</w:t>
             </w:r>
           </w:p>
         </w:tc>
@@ -618,23 +607,23 @@
               <w:rPr>
                 <w:sz w:val="18"/>
               </w:rPr>
-              <w:t xml:space="preserve"> The inputs are commodity: stores, ordering platforms, recipes and nutrition data are open to anyone. The one exclusive tie in the category, Albertsons owning Mealime, turned into the reason users left. HushPlate's own spec commits to "agnostic" stores and agents, the opposite of exclusivity.</w:t>
-            </w:r>
-          </w:p>
-        </w:tc>
-        <w:tc>
-          <w:tcPr>
-            <w:tcW w:w="2520" w:type="dxa"/>
-          </w:tcPr>
-          <w:p>
-            <w:pPr>
-              <w:spacing w:before="40" w:after="40"/>
-            </w:pPr>
-            <w:r>
-              <w:rPr>
-                <w:sz w:val="18"/>
-              </w:rPr>
-              <w:t xml:space="preserve">spec-audit.md, section 5: grocery stores, delivery and recipe content are each marked "Yes," a competitor could buy them. competitors.md: "Being retailer-neutral ... is a position no well-funded competitor can copy, because their owners bought them for the lock-in." prd-1.md: "The grocery stores the app depends upon are agnostic."</w:t>
+              <w:t xml:space="preserve"> The inputs are commodity: stores, ordering platforms, recipes and nutrition data are open to anyone. The one exclusive tie in the category, Albertsons owning Mealime, turned into the reason users left. HushPlate's spec commits to "agnostic" stores and agents, the opposite of exclusivity.</w:t>
+            </w:r>
+          </w:p>
+        </w:tc>
+        <w:tc>
+          <w:tcPr>
+            <w:tcW w:w="2520" w:type="dxa"/>
+          </w:tcPr>
+          <w:p>
+            <w:pPr>
+              <w:spacing w:before="40" w:after="40"/>
+            </w:pPr>
+            <w:r>
+              <w:rPr>
+                <w:sz w:val="18"/>
+              </w:rPr>
+              <w:t xml:space="preserve">spec-audit-UPDATED.md, section 5: grocery stores and delivery are marked "Yes," a competitor could buy them, and "prd-2.md adds no new outside provider." competitors.md: "Being retailer-neutral ... is a position no well-funded competitor can copy, because their owners bought them for the lock-in."</w:t>
             </w:r>
           </w:p>
         </w:tc>
@@ -662,7 +651,7 @@
     </w:p>
     <w:p>
       <w:r>
-        <w:t xml:space="preserve">Ranked by whether we could plausibly start building the barrier in the next twelve months, at our current size, with what prd-1.md already commits us to.</w:t>
+        <w:t xml:space="preserve">Ranked by whether we could plausibly start building the barrier in the next twelve months, at our current size, with what prd-2.md already commits us to.</w:t>
       </w:r>
     </w:p>
     <w:p>
@@ -746,7 +735,7 @@
                 <w:b/>
                 <w:sz w:val="18"/>
               </w:rPr>
-              <w:t xml:space="preserve">What prd-1.md already commits to</w:t>
+              <w:t xml:space="preserve">What prd-2.md already commits to</w:t>
             </w:r>
           </w:p>
         </w:tc>
@@ -816,23 +805,23 @@
               <w:rPr>
                 <w:sz w:val="18"/>
               </w:rPr>
-              <w:t xml:space="preserve">Health statistics, pantry, workout plan, daily audit history and recommendations are all kept: "All data about a user is maintained for the user until the user terminates services." "Users cannot delete app data before ending services." Per-user learning: "aggregating the days data from day to day for each user." Export is a PDF User Health Report.</w:t>
-            </w:r>
-          </w:p>
-        </w:tc>
-        <w:tc>
-          <w:tcPr>
-            <w:tcW w:w="2520" w:type="dxa"/>
-          </w:tcPr>
-          <w:p>
-            <w:pPr>
-              <w:spacing w:before="40" w:after="40"/>
-            </w:pPr>
-            <w:r>
-              <w:rPr>
-                <w:sz w:val="18"/>
-              </w:rPr>
-              <w:t xml:space="preserve">The barrier starts building with each user's first day of use, at any size. A PDF report goes to a doctor; it isn't something a rival app can import, so the history and personal learning stay behind.</w:t>
+              <w:t xml:space="preserve">Health statistics, pantry, workout plan, wake and bed times, daily audit history, Daily Health Score history and recommendations are all kept: "All data about a user is maintained for the user until the user terminates services." "Users cannot delete app data before ending services." Export is a PDF User Health Report. Groups: "A user can be in more than 1 family and/or friend group."</w:t>
+            </w:r>
+          </w:p>
+        </w:tc>
+        <w:tc>
+          <w:tcPr>
+            <w:tcW w:w="2520" w:type="dxa"/>
+          </w:tcPr>
+          <w:p>
+            <w:pPr>
+              <w:spacing w:before="40" w:after="40"/>
+            </w:pPr>
+            <w:r>
+              <w:rPr>
+                <w:sz w:val="18"/>
+              </w:rPr>
+              <w:t xml:space="preserve">The barrier starts building on each user's first day, at any size. Leaving now costs two things. One is the user's history and score trend, which leave only as a PDF meant for a doctor, not as something a rival app can import. The other is their groups, which only exist inside HushPlate.</w:t>
             </w:r>
           </w:p>
         </w:tc>
@@ -884,23 +873,23 @@
               <w:rPr>
                 <w:sz w:val="18"/>
               </w:rPr>
-              <w:t xml:space="preserve">"As more people join, the app will improve by providing updates regarding popular choices for top 10% of users on the app, providing weekly recommendations to all users."</w:t>
-            </w:r>
-          </w:p>
-        </w:tc>
-        <w:tc>
-          <w:tcPr>
-            <w:tcW w:w="2520" w:type="dxa"/>
-          </w:tcPr>
-          <w:p>
-            <w:pPr>
-              <w:spacing w:before="40" w:after="40"/>
-            </w:pPr>
-            <w:r>
-              <w:rPr>
-                <w:sz w:val="18"/>
-              </w:rPr>
-              <w:t xml:space="preserve">The mechanism is fully specified and can launch in year one. The barrier stays thin at small size: the top 10% of a small user base is a handful of people, and ties are broken alphabetically. It ranks second because nothing stops us from starting it, not because it will be strong.</w:t>
+              <w:t xml:space="preserve">Two mechanisms. "weekly recommendations to all users" built from "popular choices for top 10% of users," and family and friend groups that add people by avatar name or "by sending a friend request."</w:t>
+            </w:r>
+          </w:p>
+        </w:tc>
+        <w:tc>
+          <w:tcPr>
+            <w:tcW w:w="2520" w:type="dxa"/>
+          </w:tcPr>
+          <w:p>
+            <w:pPr>
+              <w:spacing w:before="40" w:after="40"/>
+            </w:pPr>
+            <w:r>
+              <w:rPr>
+                <w:sz w:val="18"/>
+              </w:rPr>
+              <w:t xml:space="preserve">The group mechanism doesn't need a large user base. It works as soon as one family or circle of friends joins, so it can start in year one. The top-10% mechanism stays thin at small size, because the top 10% of a small user base is a handful of people. It ranks second because the group side can genuinely start now, not because it will be strong.</w:t>
             </w:r>
           </w:p>
         </w:tc>
@@ -1130,7 +1119,7 @@
               <w:rPr>
                 <w:sz w:val="18"/>
               </w:rPr>
-              <w:t xml:space="preserve">Needs years of operating history: a refined way of producing plans, carts and exclusions that rivals can't copy even when they can see it. We have no operating history, and the PRD names no source for the inputs it would refine (recipe, nutrition, restaurant and calories-burned data).</w:t>
+              <w:t xml:space="preserve">Needs years of operating history: a refined way of producing plans, carts, meal timings and scores that rivals can't copy even when they can see it. We have no operating history, and the PRD names no source for the inputs it would refine (recipe, nutrition, restaurant and calories-burned data).</w:t>
             </w:r>
           </w:p>
         </w:tc>
@@ -1266,7 +1255,7 @@
               <w:rPr>
                 <w:sz w:val="18"/>
               </w:rPr>
-              <w:t xml:space="preserve">Needs scale we don't have, and the cost structure resists it. Each order goes through a bought AI agent ("Payment and address data will be taken by the AI agent that this app connects to via an API"), so per-order costs don't fall much as we grow.</w:t>
+              <w:t xml:space="preserve">Needs scale we don't have, and the cost structure resists it. Each order goes through a bought AI agent ("Payment and address data will be taken by the AI agent that this app connects to via an API"), and the spec rules out inventory, so per-order costs don't fall much as we grow.</w:t>
             </w:r>
           </w:p>
         </w:tc>
@@ -1321,7 +1310,7 @@
     </w:p>
     <w:p>
       <w:r>
-        <w:t xml:space="preserve">This is a consumer health app in a category where the features are copyable and the dependencies are for sale. That leaves two things that decide where a user goes: which name they trust enough to try, and what they'd lose by leaving. The second, switching costs, is the one barrier we can build now, but it only protects users we already have and have kept long enough to build up history. It does nothing to win the first download, which is where brand works, and brand is out of reach for years. So for the foreseeable future, getting customers is unprotected. Any user we attract is equally reachable by MyFitnessPal, which already bundles "personalized meal plans, integrated grocery delivery" under a name with 2.4M ratings. The switching cost the spec builds also pulls against the brand we lack. Data that can't be deleted "before ending services" and leaves only as a PDF runs against the trust signals competitors.md found users asking for ("an easy cancel," "export-on-demand"). The one barrier we can build now works against the one we most need and can't yet build.</w:t>
+        <w:t xml:space="preserve">This is a consumer health app in a category where the features are copyable and the dependencies are for sale. That leaves two things that decide where a user goes: which name they trust enough to try, and what they'd lose by leaving. prd-2.md makes the second stronger. Leaving now means leaving your score history and your family and friend groups, not just your data. But switching costs only protect users who have already joined. Groups can pull in a member's family and friends, but only after someone in that circle has picked HushPlate over a name they already know, and that first choice is where brand works. Brand is years away. Meanwhile any user we attract is equally reachable by MyFitnessPal, which already bundles "personalized meal plans, integrated grocery delivery" under a name with 2.4M ratings. prd-2.md also adds new points of friction with the trust that brand is built on. Top-10% users "cannot opt out of having their choices shown, or their Daily Health Score," and data still can't be deleted "before ending services" and leaves only as a PDF. Those run against the trust signals competitors.md found users asking for ("an easy cancel," "export-on-demand"). So the barriers we can build now work against the one we most need and can't yet build.</w:t>
       </w:r>
     </w:p>
     <w:sectPr>

</xml_diff>